<commit_message>
Add screenshots of computational results to GOST report
Screenshots inserted at corresponding sections in REPORT_GOST.md:
- 01_meme_overview.png    : 6 motifs found by MEME on 32 upstream regions
- 02_meme_motif1_detail.png : Motif 1 PWM logo + aligned binding sites
- 03_fimo_overview.png    : FIMO database/motif summary + hit table
- 04_prokka_stats.png     : Sudilovsky.txt + log fragment + RefSeq comparison
- 05_hmmer_tetr.png       : 19 TetR-family proteins from hmmscan PF00440
- 06_genbank_tetr_sites.png : Final GenBank with 32 protein_bind features

Switched mainfont back to DejaVu Serif (Times New Roman not installed),
added \\cyrillicfont mapping for polyglossia. PDF now 28 pages A4.

Co-Authored-By: Devin AI <158243242+devin-ai-integration[bot]@users.noreply.github.com>
</commit_message>
<xml_diff>
--- a/REPORT_GOST.docx
+++ b/REPORT_GOST.docx
@@ -3547,13 +3547,97 @@
     </w:p>
     <w:p>
       <w:pPr>
+        <w:pStyle w:val="CaptionedFigure"/>
+      </w:pPr>
+      <w:bookmarkStart w:id="42" w:name="fig:prokka"/>
+      <w:r>
+        <w:drawing>
+          <wp:inline>
+            <wp:extent cx="5334000" cy="4000500"/>
+            <wp:effectExtent b="0" l="0" r="0" t="0"/>
+            <wp:docPr descr="Сводная статистика аннотации Prokka и сравнение с RefSeq (файл annotation/Sudilovsky.txt и фрагмент Sudilovsky.log)" title="" id="1" name="Picture"/>
+            <a:graphic>
+              <a:graphicData uri="http://schemas.openxmlformats.org/drawingml/2006/picture">
+                <pic:pic>
+                  <pic:nvPicPr>
+                    <pic:cNvPr descr="screenshots/04_prokka_stats.png" id="0" name="Picture"/>
+                    <pic:cNvPicPr>
+                      <a:picLocks noChangeArrowheads="1" noChangeAspect="1"/>
+                    </pic:cNvPicPr>
+                  </pic:nvPicPr>
+                  <pic:blipFill>
+                    <a:blip r:embed="rId41"/>
+                    <a:stretch>
+                      <a:fillRect/>
+                    </a:stretch>
+                  </pic:blipFill>
+                  <pic:spPr bwMode="auto">
+                    <a:xfrm>
+                      <a:off x="0" y="0"/>
+                      <a:ext cx="5334000" cy="4000500"/>
+                    </a:xfrm>
+                    <a:prstGeom prst="rect">
+                      <a:avLst/>
+                    </a:prstGeom>
+                    <a:noFill/>
+                    <a:ln w="9525">
+                      <a:noFill/>
+                      <a:headEnd/>
+                      <a:tailEnd/>
+                    </a:ln>
+                  </pic:spPr>
+                </pic:pic>
+              </a:graphicData>
+            </a:graphic>
+          </wp:inline>
+        </w:drawing>
+      </w:r>
+      <w:bookmarkEnd w:id="42"/>
+    </w:p>
+    <w:p>
+      <w:pPr>
+        <w:pStyle w:val="ImageCaption"/>
+      </w:pPr>
+      <w:r>
+        <w:t xml:space="preserve">Сводная статистика аннотации Prokka и сравнение с RefSeq (файл</w:t>
+      </w:r>
+      <w:r>
+        <w:t xml:space="preserve"> </w:t>
+      </w:r>
+      <w:r>
+        <w:rPr>
+          <w:rStyle w:val="VerbatimChar"/>
+        </w:rPr>
+        <w:t xml:space="preserve">annotation/Sudilovsky.txt</w:t>
+      </w:r>
+      <w:r>
+        <w:t xml:space="preserve"> </w:t>
+      </w:r>
+      <w:r>
+        <w:t xml:space="preserve">и фрагмент</w:t>
+      </w:r>
+      <w:r>
+        <w:t xml:space="preserve"> </w:t>
+      </w:r>
+      <w:r>
+        <w:rPr>
+          <w:rStyle w:val="VerbatimChar"/>
+        </w:rPr>
+        <w:t xml:space="preserve">Sudilovsky.log</w:t>
+      </w:r>
+      <w:r>
+        <w:t xml:space="preserve">)</w:t>
+      </w:r>
+    </w:p>
+    <w:p>
+      <w:pPr>
         <w:pStyle w:val="Heading3"/>
       </w:pPr>
-      <w:bookmarkStart w:id="41" w:name="образец-genbank-записи-prokka"/>
+      <w:bookmarkStart w:id="43" w:name="образец-genbank-записи-prokka"/>
       <w:r>
         <w:t xml:space="preserve">Образец GenBank-записи Prokka</w:t>
       </w:r>
-      <w:bookmarkEnd w:id="41"/>
+      <w:bookmarkEnd w:id="43"/>
     </w:p>
     <w:p>
       <w:pPr>
@@ -3579,11 +3663,11 @@
       <w:pPr>
         <w:pStyle w:val="Heading2"/>
       </w:pPr>
-      <w:bookmarkStart w:id="42" w:name="X26f4efa9becc6fef1a84b3e471dbb0fe18cd6b7"/>
+      <w:bookmarkStart w:id="44" w:name="X26f4efa9becc6fef1a84b3e471dbb0fe18cd6b7"/>
       <w:r>
         <w:t xml:space="preserve">Сравнение с эталонной аннотацией NCBI RefSeq</w:t>
       </w:r>
-      <w:bookmarkEnd w:id="42"/>
+      <w:bookmarkEnd w:id="44"/>
     </w:p>
     <w:p>
       <w:pPr>
@@ -4131,11 +4215,11 @@
       <w:pPr>
         <w:pStyle w:val="Heading2"/>
       </w:pPr>
-      <w:bookmarkStart w:id="43" w:name="поиск-белков-семейства-tetr-1"/>
+      <w:bookmarkStart w:id="45" w:name="поиск-белков-семейства-tetr-1"/>
       <w:r>
         <w:t xml:space="preserve">Поиск белков семейства TetR</w:t>
       </w:r>
-      <w:bookmarkEnd w:id="43"/>
+      <w:bookmarkEnd w:id="45"/>
     </w:p>
     <w:p>
       <w:pPr>
@@ -4404,9 +4488,81 @@
     </w:p>
     <w:p>
       <w:pPr>
+        <w:pStyle w:val="CaptionedFigure"/>
+      </w:pPr>
+      <w:bookmarkStart w:id="47" w:name="fig:hmmer"/>
+      <w:r>
+        <w:drawing>
+          <wp:inline>
+            <wp:extent cx="5334000" cy="4000500"/>
+            <wp:effectExtent b="0" l="0" r="0" t="0"/>
+            <wp:docPr descr="Все 19 белков семейства TetR (домен PF00440) с их E-value, найденные программой hmmscan против Pfam-A" title="" id="1" name="Picture"/>
+            <a:graphic>
+              <a:graphicData uri="http://schemas.openxmlformats.org/drawingml/2006/picture">
+                <pic:pic>
+                  <pic:nvPicPr>
+                    <pic:cNvPr descr="screenshots/05_hmmer_tetr.png" id="0" name="Picture"/>
+                    <pic:cNvPicPr>
+                      <a:picLocks noChangeArrowheads="1" noChangeAspect="1"/>
+                    </pic:cNvPicPr>
+                  </pic:nvPicPr>
+                  <pic:blipFill>
+                    <a:blip r:embed="rId46"/>
+                    <a:stretch>
+                      <a:fillRect/>
+                    </a:stretch>
+                  </pic:blipFill>
+                  <pic:spPr bwMode="auto">
+                    <a:xfrm>
+                      <a:off x="0" y="0"/>
+                      <a:ext cx="5334000" cy="4000500"/>
+                    </a:xfrm>
+                    <a:prstGeom prst="rect">
+                      <a:avLst/>
+                    </a:prstGeom>
+                    <a:noFill/>
+                    <a:ln w="9525">
+                      <a:noFill/>
+                      <a:headEnd/>
+                      <a:tailEnd/>
+                    </a:ln>
+                  </pic:spPr>
+                </pic:pic>
+              </a:graphicData>
+            </a:graphic>
+          </wp:inline>
+        </w:drawing>
+      </w:r>
+      <w:bookmarkEnd w:id="47"/>
+    </w:p>
+    <w:p>
+      <w:pPr>
+        <w:pStyle w:val="ImageCaption"/>
+      </w:pPr>
+      <w:r>
+        <w:t xml:space="preserve">Все 19 белков семейства TetR (домен PF00440) с их E-value, найденные программой</w:t>
+      </w:r>
+      <w:r>
+        <w:t xml:space="preserve"> </w:t>
+      </w:r>
+      <w:r>
+        <w:rPr>
+          <w:rStyle w:val="VerbatimChar"/>
+        </w:rPr>
+        <w:t xml:space="preserve">hmmscan</w:t>
+      </w:r>
+      <w:r>
+        <w:t xml:space="preserve"> </w:t>
+      </w:r>
+      <w:r>
+        <w:t xml:space="preserve">против Pfam-A</w:t>
+      </w:r>
+    </w:p>
+    <w:p>
+      <w:pPr>
         <w:pStyle w:val="Heading2"/>
       </w:pPr>
-      <w:bookmarkStart w:id="44" w:name="X7a37e39fc6da1de3cb5ebe2787f6806d3c3dc1d"/>
+      <w:bookmarkStart w:id="48" w:name="X7a37e39fc6da1de3cb5ebe2787f6806d3c3dc1d"/>
       <w:r>
         <w:rPr>
           <w:i/>
@@ -4419,17 +4575,17 @@
       <w:r>
         <w:t xml:space="preserve">построение мотива операторного сайта (MEME)</w:t>
       </w:r>
-      <w:bookmarkEnd w:id="44"/>
+      <w:bookmarkEnd w:id="48"/>
     </w:p>
     <w:p>
       <w:pPr>
         <w:pStyle w:val="Heading3"/>
       </w:pPr>
-      <w:bookmarkStart w:id="45" w:name="извлечение-upstream-областей"/>
+      <w:bookmarkStart w:id="49" w:name="извлечение-upstream-областей"/>
       <w:r>
         <w:t xml:space="preserve">Извлечение upstream-областей</w:t>
       </w:r>
-      <w:bookmarkEnd w:id="45"/>
+      <w:bookmarkEnd w:id="49"/>
     </w:p>
     <w:p>
       <w:pPr>
@@ -4494,11 +4650,11 @@
       <w:pPr>
         <w:pStyle w:val="Heading3"/>
       </w:pPr>
-      <w:bookmarkStart w:id="46" w:name="запуск-meme"/>
+      <w:bookmarkStart w:id="50" w:name="запуск-meme"/>
       <w:r>
         <w:t xml:space="preserve">Запуск MEME</w:t>
       </w:r>
-      <w:bookmarkEnd w:id="46"/>
+      <w:bookmarkEnd w:id="50"/>
     </w:p>
     <w:p>
       <w:pPr>
@@ -4747,7 +4903,7 @@
       <w:pPr>
         <w:pStyle w:val="CaptionedFigure"/>
       </w:pPr>
-      <w:bookmarkStart w:id="48" w:name="fig:logo"/>
+      <w:bookmarkStart w:id="52" w:name="fig:logo"/>
       <w:r>
         <w:drawing>
           <wp:inline>
@@ -4764,7 +4920,7 @@
                     </pic:cNvPicPr>
                   </pic:nvPicPr>
                   <pic:blipFill>
-                    <a:blip r:embed="rId47"/>
+                    <a:blip r:embed="rId51"/>
                     <a:stretch>
                       <a:fillRect/>
                     </a:stretch>
@@ -4790,7 +4946,7 @@
           </wp:inline>
         </w:drawing>
       </w:r>
-      <w:bookmarkEnd w:id="48"/>
+      <w:bookmarkEnd w:id="52"/>
     </w:p>
     <w:p>
       <w:pPr>
@@ -4817,13 +4973,127 @@
     </w:p>
     <w:p>
       <w:pPr>
+        <w:pStyle w:val="CaptionedFigure"/>
+      </w:pPr>
+      <w:bookmarkStart w:id="54" w:name="fig:meme_over"/>
+      <w:r>
+        <w:drawing>
+          <wp:inline>
+            <wp:extent cx="5334000" cy="4000500"/>
+            <wp:effectExtent b="0" l="0" r="0" t="0"/>
+            <wp:docPr descr="Веб-страница MEME: список 6 значимых мотивов (логотипы, E-value, число сайтов) и общая карта расположений на 32 апстрим-областях" title="" id="1" name="Picture"/>
+            <a:graphic>
+              <a:graphicData uri="http://schemas.openxmlformats.org/drawingml/2006/picture">
+                <pic:pic>
+                  <pic:nvPicPr>
+                    <pic:cNvPr descr="screenshots/01_meme_overview.png" id="0" name="Picture"/>
+                    <pic:cNvPicPr>
+                      <a:picLocks noChangeArrowheads="1" noChangeAspect="1"/>
+                    </pic:cNvPicPr>
+                  </pic:nvPicPr>
+                  <pic:blipFill>
+                    <a:blip r:embed="rId53"/>
+                    <a:stretch>
+                      <a:fillRect/>
+                    </a:stretch>
+                  </pic:blipFill>
+                  <pic:spPr bwMode="auto">
+                    <a:xfrm>
+                      <a:off x="0" y="0"/>
+                      <a:ext cx="5334000" cy="4000500"/>
+                    </a:xfrm>
+                    <a:prstGeom prst="rect">
+                      <a:avLst/>
+                    </a:prstGeom>
+                    <a:noFill/>
+                    <a:ln w="9525">
+                      <a:noFill/>
+                      <a:headEnd/>
+                      <a:tailEnd/>
+                    </a:ln>
+                  </pic:spPr>
+                </pic:pic>
+              </a:graphicData>
+            </a:graphic>
+          </wp:inline>
+        </w:drawing>
+      </w:r>
+      <w:bookmarkEnd w:id="54"/>
+    </w:p>
+    <w:p>
+      <w:pPr>
+        <w:pStyle w:val="ImageCaption"/>
+      </w:pPr>
+      <w:r>
+        <w:t xml:space="preserve">Веб-страница MEME: список 6 значимых мотивов (логотипы, E-value, число сайтов) и общая карта расположений на 32 апстрим-областях</w:t>
+      </w:r>
+    </w:p>
+    <w:p>
+      <w:pPr>
+        <w:pStyle w:val="CaptionedFigure"/>
+      </w:pPr>
+      <w:bookmarkStart w:id="56" w:name="fig:meme_detail"/>
+      <w:r>
+        <w:drawing>
+          <wp:inline>
+            <wp:extent cx="5334000" cy="4000500"/>
+            <wp:effectExtent b="0" l="0" r="0" t="0"/>
+            <wp:docPr descr="Подробное представление мотива №1 в MEME: PWM-логотип, информационное содержание (19,8 бит), Bayes Threshold 9,06647 и таблица сайтов в обучающей выборке" title="" id="1" name="Picture"/>
+            <a:graphic>
+              <a:graphicData uri="http://schemas.openxmlformats.org/drawingml/2006/picture">
+                <pic:pic>
+                  <pic:nvPicPr>
+                    <pic:cNvPr descr="screenshots/02_meme_motif1_detail.png" id="0" name="Picture"/>
+                    <pic:cNvPicPr>
+                      <a:picLocks noChangeArrowheads="1" noChangeAspect="1"/>
+                    </pic:cNvPicPr>
+                  </pic:nvPicPr>
+                  <pic:blipFill>
+                    <a:blip r:embed="rId55"/>
+                    <a:stretch>
+                      <a:fillRect/>
+                    </a:stretch>
+                  </pic:blipFill>
+                  <pic:spPr bwMode="auto">
+                    <a:xfrm>
+                      <a:off x="0" y="0"/>
+                      <a:ext cx="5334000" cy="4000500"/>
+                    </a:xfrm>
+                    <a:prstGeom prst="rect">
+                      <a:avLst/>
+                    </a:prstGeom>
+                    <a:noFill/>
+                    <a:ln w="9525">
+                      <a:noFill/>
+                      <a:headEnd/>
+                      <a:tailEnd/>
+                    </a:ln>
+                  </pic:spPr>
+                </pic:pic>
+              </a:graphicData>
+            </a:graphic>
+          </wp:inline>
+        </w:drawing>
+      </w:r>
+      <w:bookmarkEnd w:id="56"/>
+    </w:p>
+    <w:p>
+      <w:pPr>
+        <w:pStyle w:val="ImageCaption"/>
+      </w:pPr>
+      <w:r>
+        <w:t xml:space="preserve">Подробное представление мотива №1 в MEME: PWM-логотип, информационное содержание (19,8 бит), Bayes Threshold 9,06647 и таблица сайтов в обучающей выборке</w:t>
+      </w:r>
+    </w:p>
+    <w:p>
+      <w:pPr>
         <w:pStyle w:val="Heading2"/>
       </w:pPr>
-      <w:bookmarkStart w:id="49" w:name="сканирование-генома-fimo"/>
+      <w:bookmarkStart w:id="57" w:name="сканирование-генома-fimo"/>
       <w:r>
         <w:t xml:space="preserve">Сканирование генома (FIMO)</w:t>
       </w:r>
-      <w:bookmarkEnd w:id="49"/>
+      <w:bookmarkEnd w:id="57"/>
     </w:p>
     <w:p>
       <w:pPr>
@@ -4978,6 +5248,63 @@
     </w:p>
     <w:p>
       <w:pPr>
+        <w:pStyle w:val="CaptionedFigure"/>
+      </w:pPr>
+      <w:bookmarkStart w:id="59" w:name="fig:fimo"/>
+      <w:r>
+        <w:drawing>
+          <wp:inline>
+            <wp:extent cx="5334000" cy="4000500"/>
+            <wp:effectExtent b="0" l="0" r="0" t="0"/>
+            <wp:docPr descr="Веб-вывод FIMO: раздел DATABASE AND MOTIFS, таблица 6 мотивов с шириной и лучшим совпадением, начало таблицы HIGH-SCORING MOTIF OCCURRENCES (1 437 хитов в геноме)" title="" id="1" name="Picture"/>
+            <a:graphic>
+              <a:graphicData uri="http://schemas.openxmlformats.org/drawingml/2006/picture">
+                <pic:pic>
+                  <pic:nvPicPr>
+                    <pic:cNvPr descr="screenshots/03_fimo_overview.png" id="0" name="Picture"/>
+                    <pic:cNvPicPr>
+                      <a:picLocks noChangeArrowheads="1" noChangeAspect="1"/>
+                    </pic:cNvPicPr>
+                  </pic:nvPicPr>
+                  <pic:blipFill>
+                    <a:blip r:embed="rId58"/>
+                    <a:stretch>
+                      <a:fillRect/>
+                    </a:stretch>
+                  </pic:blipFill>
+                  <pic:spPr bwMode="auto">
+                    <a:xfrm>
+                      <a:off x="0" y="0"/>
+                      <a:ext cx="5334000" cy="4000500"/>
+                    </a:xfrm>
+                    <a:prstGeom prst="rect">
+                      <a:avLst/>
+                    </a:prstGeom>
+                    <a:noFill/>
+                    <a:ln w="9525">
+                      <a:noFill/>
+                      <a:headEnd/>
+                      <a:tailEnd/>
+                    </a:ln>
+                  </pic:spPr>
+                </pic:pic>
+              </a:graphicData>
+            </a:graphic>
+          </wp:inline>
+        </w:drawing>
+      </w:r>
+      <w:bookmarkEnd w:id="59"/>
+    </w:p>
+    <w:p>
+      <w:pPr>
+        <w:pStyle w:val="ImageCaption"/>
+      </w:pPr>
+      <w:r>
+        <w:t xml:space="preserve">Веб-вывод FIMO: раздел DATABASE AND MOTIFS, таблица 6 мотивов с шириной и лучшим совпадением, начало таблицы HIGH-SCORING MOTIF OCCURRENCES (1 437 хитов в геноме)</w:t>
+      </w:r>
+    </w:p>
+    <w:p>
+      <w:pPr>
         <w:pStyle w:val="BodyText"/>
       </w:pPr>
       <w:r>
@@ -5027,21 +5354,21 @@
       <w:pPr>
         <w:pStyle w:val="Heading2"/>
       </w:pPr>
-      <w:bookmarkStart w:id="50" w:name="биологическая-интерпретация"/>
+      <w:bookmarkStart w:id="60" w:name="биологическая-интерпретация"/>
       <w:r>
         <w:t xml:space="preserve">Биологическая интерпретация</w:t>
       </w:r>
-      <w:bookmarkEnd w:id="50"/>
+      <w:bookmarkEnd w:id="60"/>
     </w:p>
     <w:p>
       <w:pPr>
         <w:pStyle w:val="Heading3"/>
       </w:pPr>
-      <w:bookmarkStart w:id="51" w:name="авторегуляция"/>
+      <w:bookmarkStart w:id="61" w:name="авторегуляция"/>
       <w:r>
         <w:t xml:space="preserve">Авторегуляция</w:t>
       </w:r>
-      <w:bookmarkEnd w:id="51"/>
+      <w:bookmarkEnd w:id="61"/>
     </w:p>
     <w:p>
       <w:pPr>
@@ -5142,11 +5469,11 @@
       <w:pPr>
         <w:pStyle w:val="Heading3"/>
       </w:pPr>
-      <w:bookmarkStart w:id="52" w:name="потенциальные-регулоны"/>
+      <w:bookmarkStart w:id="62" w:name="потенциальные-регулоны"/>
       <w:r>
         <w:t xml:space="preserve">Потенциальные регулоны</w:t>
       </w:r>
-      <w:bookmarkEnd w:id="52"/>
+      <w:bookmarkEnd w:id="62"/>
     </w:p>
     <w:p>
       <w:pPr>
@@ -5306,11 +5633,11 @@
       <w:pPr>
         <w:pStyle w:val="Heading2"/>
       </w:pPr>
-      <w:bookmarkStart w:id="53" w:name="финальный-genbank-файл"/>
+      <w:bookmarkStart w:id="63" w:name="финальный-genbank-файл"/>
       <w:r>
         <w:t xml:space="preserve">Финальный GenBank-файл</w:t>
       </w:r>
-      <w:bookmarkEnd w:id="53"/>
+      <w:bookmarkEnd w:id="63"/>
     </w:p>
     <w:p>
       <w:pPr>
@@ -5369,13 +5696,136 @@
     </w:p>
     <w:p>
       <w:pPr>
+        <w:pStyle w:val="CaptionedFigure"/>
+      </w:pPr>
+      <w:bookmarkStart w:id="65" w:name="fig:gbk"/>
+      <w:r>
+        <w:drawing>
+          <wp:inline>
+            <wp:extent cx="5334000" cy="4000500"/>
+            <wp:effectExtent b="0" l="0" r="0" t="0"/>
+            <wp:docPr descr="Структура итогового GenBank-файла Sudilovsky_TetR.gbk: заголовок LOCUS, фичи protein_bind для предсказанных операторов TetR с квалификаторами /bound_moiety, /note, /label и сводная статистика по 32 сайтам" title="" id="1" name="Picture"/>
+            <a:graphic>
+              <a:graphicData uri="http://schemas.openxmlformats.org/drawingml/2006/picture">
+                <pic:pic>
+                  <pic:nvPicPr>
+                    <pic:cNvPr descr="screenshots/06_genbank_tetr_sites.png" id="0" name="Picture"/>
+                    <pic:cNvPicPr>
+                      <a:picLocks noChangeArrowheads="1" noChangeAspect="1"/>
+                    </pic:cNvPicPr>
+                  </pic:nvPicPr>
+                  <pic:blipFill>
+                    <a:blip r:embed="rId64"/>
+                    <a:stretch>
+                      <a:fillRect/>
+                    </a:stretch>
+                  </pic:blipFill>
+                  <pic:spPr bwMode="auto">
+                    <a:xfrm>
+                      <a:off x="0" y="0"/>
+                      <a:ext cx="5334000" cy="4000500"/>
+                    </a:xfrm>
+                    <a:prstGeom prst="rect">
+                      <a:avLst/>
+                    </a:prstGeom>
+                    <a:noFill/>
+                    <a:ln w="9525">
+                      <a:noFill/>
+                      <a:headEnd/>
+                      <a:tailEnd/>
+                    </a:ln>
+                  </pic:spPr>
+                </pic:pic>
+              </a:graphicData>
+            </a:graphic>
+          </wp:inline>
+        </w:drawing>
+      </w:r>
+      <w:bookmarkEnd w:id="65"/>
+    </w:p>
+    <w:p>
+      <w:pPr>
+        <w:pStyle w:val="ImageCaption"/>
+      </w:pPr>
+      <w:r>
+        <w:t xml:space="preserve">Структура итогового GenBank-файла</w:t>
+      </w:r>
+      <w:r>
+        <w:t xml:space="preserve"> </w:t>
+      </w:r>
+      <w:r>
+        <w:rPr>
+          <w:rStyle w:val="VerbatimChar"/>
+        </w:rPr>
+        <w:t xml:space="preserve">Sudilovsky_TetR.gbk</w:t>
+      </w:r>
+      <w:r>
+        <w:t xml:space="preserve">: заголовок LOCUS, фичи</w:t>
+      </w:r>
+      <w:r>
+        <w:t xml:space="preserve"> </w:t>
+      </w:r>
+      <w:r>
+        <w:rPr>
+          <w:rStyle w:val="VerbatimChar"/>
+        </w:rPr>
+        <w:t xml:space="preserve">protein_bind</w:t>
+      </w:r>
+      <w:r>
+        <w:t xml:space="preserve"> </w:t>
+      </w:r>
+      <w:r>
+        <w:t xml:space="preserve">для предсказанных операторов TetR с квалификаторами</w:t>
+      </w:r>
+      <w:r>
+        <w:t xml:space="preserve"> </w:t>
+      </w:r>
+      <w:r>
+        <w:rPr>
+          <w:rStyle w:val="VerbatimChar"/>
+        </w:rPr>
+        <w:t xml:space="preserve">/bound_moiety</w:t>
+      </w:r>
+      <w:r>
+        <w:t xml:space="preserve">,</w:t>
+      </w:r>
+      <w:r>
+        <w:t xml:space="preserve"> </w:t>
+      </w:r>
+      <w:r>
+        <w:rPr>
+          <w:rStyle w:val="VerbatimChar"/>
+        </w:rPr>
+        <w:t xml:space="preserve">/note</w:t>
+      </w:r>
+      <w:r>
+        <w:t xml:space="preserve">,</w:t>
+      </w:r>
+      <w:r>
+        <w:t xml:space="preserve"> </w:t>
+      </w:r>
+      <w:r>
+        <w:rPr>
+          <w:rStyle w:val="VerbatimChar"/>
+        </w:rPr>
+        <w:t xml:space="preserve">/label</w:t>
+      </w:r>
+      <w:r>
+        <w:t xml:space="preserve"> </w:t>
+      </w:r>
+      <w:r>
+        <w:t xml:space="preserve">и сводная статистика по 32 сайтам</w:t>
+      </w:r>
+    </w:p>
+    <w:p>
+      <w:pPr>
         <w:pStyle w:val="Heading1"/>
       </w:pPr>
-      <w:bookmarkStart w:id="54" w:name="заключение"/>
+      <w:bookmarkStart w:id="66" w:name="заключение"/>
       <w:r>
         <w:t xml:space="preserve">Заключение</w:t>
       </w:r>
-      <w:bookmarkEnd w:id="54"/>
+      <w:bookmarkEnd w:id="66"/>
     </w:p>
     <w:p>
       <w:pPr>
@@ -6013,11 +6463,11 @@
       <w:pPr>
         <w:pStyle w:val="Heading1"/>
       </w:pPr>
-      <w:bookmarkStart w:id="55" w:name="список-использованных-источников"/>
+      <w:bookmarkStart w:id="67" w:name="список-использованных-источников"/>
       <w:r>
         <w:t xml:space="preserve">Список использованных источников</w:t>
       </w:r>
-      <w:bookmarkEnd w:id="55"/>
+      <w:bookmarkEnd w:id="67"/>
     </w:p>
     <w:p>
       <w:pPr>
@@ -6329,11 +6779,11 @@
       <w:pPr>
         <w:pStyle w:val="Heading1"/>
       </w:pPr>
-      <w:bookmarkStart w:id="56" w:name="Xad2ff09bc2b762559832f9089fa6b2192199bca"/>
+      <w:bookmarkStart w:id="68" w:name="Xad2ff09bc2b762559832f9089fa6b2192199bca"/>
       <w:r>
         <w:t xml:space="preserve">Приложение А. Полный список 32 сайтов связывания TetR</w:t>
       </w:r>
-      <w:bookmarkEnd w:id="56"/>
+      <w:bookmarkEnd w:id="68"/>
     </w:p>
     <w:p>
       <w:pPr>
@@ -6385,11 +6835,11 @@
       <w:pPr>
         <w:pStyle w:val="Heading1"/>
       </w:pPr>
-      <w:bookmarkStart w:id="57" w:name="Xae336c009d489c9d0065fc8e8f4645702a40820"/>
+      <w:bookmarkStart w:id="69" w:name="Xae336c009d489c9d0065fc8e8f4645702a40820"/>
       <w:r>
         <w:t xml:space="preserve">Приложение Б. Скрипт извлечения upstream-областей</w:t>
       </w:r>
-      <w:bookmarkEnd w:id="57"/>
+      <w:bookmarkEnd w:id="69"/>
     </w:p>
     <w:p>
       <w:pPr>
@@ -6415,11 +6865,11 @@
       <w:pPr>
         <w:pStyle w:val="Heading1"/>
       </w:pPr>
-      <w:bookmarkStart w:id="58" w:name="X14c8e4240bcf112b98482595fc13c8be7b1ae22"/>
+      <w:bookmarkStart w:id="70" w:name="X14c8e4240bcf112b98482595fc13c8be7b1ae22"/>
       <w:r>
         <w:t xml:space="preserve">Приложение В. Скрипт добавления сайтов в GenBank</w:t>
       </w:r>
-      <w:bookmarkEnd w:id="58"/>
+      <w:bookmarkEnd w:id="70"/>
     </w:p>
     <w:p>
       <w:pPr>

</xml_diff>